<commit_message>
Section 3 draft: Gong top-layer placement, Uchibayashi per-mineral Mg, Park electron budget, run table
Co-Authored-By: Claude Opus 5.5 <noreply@anthropic.com>
Claude-Session: https://claude.ai/code/session_011eE6rAt4DAy7w44Js7Frnz
</commit_message>
<xml_diff>
--- a/manuscript_gmd/Riceland_SCEPTER_GMD_section3_evaluation_draft.docx
+++ b/manuscript_gmd/Riceland_SCEPTER_GMD_section3_evaluation_draft.docx
@@ -1014,7 +1014,7 @@
         <w:t xml:space="preserve"> </w:t>
       </w:r>
       <w:r>
-        <w:t xml:space="preserve">- 0.3 m pot column without a pan, with basalt mixed through the column.</w:t>
+        <w:t xml:space="preserve">- 0.3 m pot column without a pan. Basalt is mixed into the top 0.086 m, the same fraction of the column (10/35) as the upper 10 kg of the 35 kg pot.</w:t>
       </w:r>
       <w:r>
         <w:t xml:space="preserve"> </w:t>
@@ -1062,7 +1062,7 @@
         <w:t xml:space="preserve"> </w:t>
       </w:r>
       <w:r>
-        <w:t xml:space="preserve">- Basalt lowered CH₄ by 25% (85 to 64 kg ha⁻¹; observed −18%).</w:t>
+        <w:t xml:space="preserve">- Basalt lowered CH₄ by 23% (85 to 65 kg ha⁻¹; observed −18%). Mixing the same dose through the whole column instead gave −25%, so amendment placement changes the result by only 2 points.</w:t>
       </w:r>
       <w:r>
         <w:t xml:space="preserve"> </w:t>
@@ -1094,7 +1094,7 @@
         <w:pStyle w:val="BodyText"/>
       </w:pPr>
       <w:r>
-        <w:t xml:space="preserve">The model overpredicts the relative CH₄ decrease by about 40% (−25% against −18%), and the control emission by about 60%. We state this explicitly, because together they make Gong et al. the weakest CH₄ comparison in the evaluation set. Gong et al. and the 2 t ha⁻¹ slag treatment of Wang et al. (2014) reach similar simulated porewater Si (~1.3 mM), yet the observed CH₄ cut is about twice as large for the slag. No single Si-response curve fits both. The adopted constants (K_Si 2 mM, w 0.2) minimise the joint misfit.</w:t>
+        <w:t xml:space="preserve">The model overpredicts the relative CH₄ decrease by about 30% (−23% against −18%), and the control emission by about 60%. We state this explicitly, because together they make Gong et al. the weakest CH₄ comparison in the evaluation set. Gong et al. and the 2 t ha⁻¹ slag treatment of Wang et al. (2014) reach similar simulated porewater Si (~1.3 mM), yet the observed CH₄ cut is about twice as large for the slag. No single Si-response curve fits both. The adopted constants (K_Si 2 mM, w 0.2) minimise the joint misfit.</w:t>
       </w:r>
     </w:p>
     <w:p>
@@ -1286,7 +1286,7 @@
         <w:pStyle w:val="BodyText"/>
       </w:pPr>
       <w:r>
-        <w:t xml:space="preserve">Park et al. is the one test in which the Si root feedback is absent by construction. It isolates the soil geochemistry: rock Fe(III) acting as an electron acceptor, the higher pH, and cation supply. The model reproduces both the size and the dose scaling of the decrease. This shows that the geochemical pathway is represented realistically at very high doses.</w:t>
+        <w:t xml:space="preserve">Park et al. is the one test in which the Si root feedback is absent by construction. It isolates the soil geochemistry: rock Fe(III) acting as an electron acceptor, the higher pH, and cation supply. The model reproduces both the size and the dose scaling of the decrease. In the model’s electron budget, basalt raises Fe(III) reduction by 0.54 and 0.94 mol C m⁻² at 10 and 20 wt%, while methanogenesis falls by 1.57 and 2.67 mol C m⁻². Electron-acceptor competition from rock Fe(III) therefore accounts directly for only about a third of the decrease. The rest is lower total organic-matter mineralisation, which in the model arises because Fe(III) inhibits methanogenesis without fully replacing it as an electron sink. Both terms depend on the rock’s reactive Fe(III), which was assumed (3% of rock Fe), not measured. We therefore treat the mechanism as uncertain and do not claim that basalt-derived Fe(III) is the established cause of the observed suppression.</w:t>
       </w:r>
     </w:p>
     <w:p>
@@ -1476,7 +1476,7 @@
         <w:pStyle w:val="BodyText"/>
       </w:pPr>
       <w:r>
-        <w:t xml:space="preserve">The excess comes mainly from olivine. Olivine makes up only 4 wt% of the rock, but its laboratory dissolution rate is two to three orders of magnitude faster than pyroxene’s, so in the model it supplies most of the Mg. Possible explanations:</w:t>
+        <w:t xml:space="preserve">The mineral-by-mineral dissolution fluxes locate the excess. Olivine supplies 11.4 of the 12.1 mmol Mg m⁻² d⁻¹ (94%), and augite the remaining 0.65. About 19% of the olivine dissolves in 99 days, against 16% of the bytownite and under 2% of the labradorite and augite. Olivine makes up only 4 wt% of the rock, but its rate law is two to three orders of magnitude faster than pyroxene’s. With dissolution close to linear at this extent, an olivine rate about half the current value (≈0.5×, applied to olivine alone) would bring Mg release to the observed 6.5 mmol m⁻² d⁻¹ without changing Na. The olivine explanation is therefore quantitatively sufficient. We do not adopt that adjustment in the reference parameterisation. Possible explanations:</w:t>
       </w:r>
     </w:p>
     <w:p>
@@ -2418,19 +2418,19 @@
               <w:jc w:val="left"/>
             </w:pPr>
             <w:r>
-              <w:t xml:space="preserve">−25% (−10% without Si feedback)</w:t>
-            </w:r>
-          </w:p>
-        </w:tc>
-        <w:tc>
-          <w:tcPr/>
-          <w:p>
-            <w:pPr>
-              <w:pStyle w:val="Compact"/>
-              <w:jc w:val="left"/>
-            </w:pPr>
-            <w:r>
-              <w:t xml:space="preserve">overpredicted ~1.4× (used in Si calibration); control 85 vs 52 kg ha⁻¹</w:t>
+              <w:t xml:space="preserve">−23% (−10% without Si feedback)</w:t>
+            </w:r>
+          </w:p>
+        </w:tc>
+        <w:tc>
+          <w:tcPr/>
+          <w:p>
+            <w:pPr>
+              <w:pStyle w:val="Compact"/>
+              <w:jc w:val="left"/>
+            </w:pPr>
+            <w:r>
+              <w:t xml:space="preserve">overpredicted ~1.3× (used in Si calibration); control 85 vs 52 kg ha⁻¹</w:t>
             </w:r>
           </w:p>
         </w:tc>
@@ -2617,6 +2617,399 @@
             </w:pPr>
             <w:r>
               <w:t xml:space="preserve">underpredicted ~2.5–4×</w:t>
+            </w:r>
+          </w:p>
+        </w:tc>
+      </w:tr>
+    </w:tbl>
+    <w:p>
+      <w:pPr>
+        <w:pStyle w:val="BodyText"/>
+      </w:pPr>
+      <w:r>
+        <w:rPr>
+          <w:bCs/>
+          <w:b/>
+        </w:rPr>
+        <w:t xml:space="preserve">Table 4.</w:t>
+      </w:r>
+      <w:r>
+        <w:t xml:space="preserve"> </w:t>
+      </w:r>
+      <w:r>
+        <w:t xml:space="preserve">Reproducibility of the evaluation runs. All runs use executable</w:t>
+      </w:r>
+      <w:r>
+        <w:t xml:space="preserve"> </w:t>
+      </w:r>
+      <w:r>
+        <w:rPr>
+          <w:rStyle w:val="VerbatimChar"/>
+        </w:rPr>
+        <w:t xml:space="preserve">scepter_paddy_v22</w:t>
+      </w:r>
+      <w:r>
+        <w:t xml:space="preserve"> </w:t>
+      </w:r>
+      <w:r>
+        <w:t xml:space="preserve">(commit 162913a) with</w:t>
+      </w:r>
+      <w:r>
+        <w:t xml:space="preserve"> </w:t>
+      </w:r>
+      <w:r>
+        <w:rPr>
+          <w:rStyle w:val="VerbatimChar"/>
+        </w:rPr>
+        <w:t xml:space="preserve">krxn_calibrated</w:t>
+      </w:r>
+      <w:r>
+        <w:t xml:space="preserve"> </w:t>
+      </w:r>
+      <w:r>
+        <w:t xml:space="preserve">constants (methanogenesis vmax 1860 yr⁻¹) and the Si feedback</w:t>
+      </w:r>
+      <w:r>
+        <w:t xml:space="preserve"> </w:t>
+      </w:r>
+      <w:r>
+        <w:rPr>
+          <w:rStyle w:val="VerbatimChar"/>
+        </w:rPr>
+        <w:t xml:space="preserve">--rtsi=2e-3:2.7e-4:0.2</w:t>
+      </w:r>
+      <w:r>
+        <w:t xml:space="preserve">. Each run restarts from its site’s settled state (3-yr drained spin-up + 7-yr settle).</w:t>
+      </w:r>
+    </w:p>
+    <w:tbl>
+      <w:tblPr>
+        <w:tblStyle w:val="Table"/>
+        <w:tblW w:type="pct" w:w="5000"/>
+        <w:tblLook w:firstRow="1" w:lastRow="0" w:firstColumn="0" w:lastColumn="0" w:noHBand="0" w:noVBand="0" w:val="0020"/>
+        <w:jc w:val="start"/>
+      </w:tblPr>
+      <w:tblGrid>
+        <w:gridCol w:w="1980"/>
+        <w:gridCol w:w="1980"/>
+        <w:gridCol w:w="1980"/>
+        <w:gridCol w:w="1980"/>
+      </w:tblGrid>
+      <w:tr>
+        <w:trPr>
+          <w:tblHeader w:val="true"/>
+        </w:trPr>
+        <w:tc>
+          <w:tcPr/>
+          <w:p>
+            <w:pPr>
+              <w:pStyle w:val="Compact"/>
+              <w:jc w:val="left"/>
+            </w:pPr>
+            <w:r>
+              <w:t xml:space="preserve">Test</w:t>
+            </w:r>
+          </w:p>
+        </w:tc>
+        <w:tc>
+          <w:tcPr/>
+          <w:p>
+            <w:pPr>
+              <w:pStyle w:val="Compact"/>
+              <w:jc w:val="left"/>
+            </w:pPr>
+            <w:r>
+              <w:t xml:space="preserve">Settled state</w:t>
+            </w:r>
+          </w:p>
+        </w:tc>
+        <w:tc>
+          <w:tcPr/>
+          <w:p>
+            <w:pPr>
+              <w:pStyle w:val="Compact"/>
+              <w:jc w:val="left"/>
+            </w:pPr>
+            <w:r>
+              <w:t xml:space="preserve">Runs (control / treatments)</w:t>
+            </w:r>
+          </w:p>
+        </w:tc>
+        <w:tc>
+          <w:tcPr/>
+          <w:p>
+            <w:pPr>
+              <w:pStyle w:val="Compact"/>
+              <w:jc w:val="left"/>
+            </w:pPr>
+            <w:r>
+              <w:t xml:space="preserve">Site options</w:t>
+            </w:r>
+          </w:p>
+        </w:tc>
+      </w:tr>
+      <w:tr>
+        <w:tc>
+          <w:tcPr/>
+          <w:p>
+            <w:pPr>
+              <w:pStyle w:val="Compact"/>
+              <w:jc w:val="left"/>
+            </w:pPr>
+            <w:r>
+              <w:t xml:space="preserve">Wang 2014</w:t>
+            </w:r>
+          </w:p>
+        </w:tc>
+        <w:tc>
+          <w:tcPr/>
+          <w:p>
+            <w:pPr>
+              <w:pStyle w:val="Compact"/>
+              <w:jc w:val="left"/>
+            </w:pPr>
+            <w:r>
+              <w:t xml:space="preserve">field column with pan, irrigation alkalinity 2 meq L⁻¹</w:t>
+            </w:r>
+          </w:p>
+        </w:tc>
+        <w:tc>
+          <w:tcPr/>
+          <w:p>
+            <w:pPr>
+              <w:pStyle w:val="Compact"/>
+              <w:jc w:val="left"/>
+            </w:pPr>
+            <w:r>
+              <w:t xml:space="preserve">z14_0 / z14_2, z14_4, z14_8</w:t>
+            </w:r>
+          </w:p>
+        </w:tc>
+        <w:tc>
+          <w:tcPr/>
+          <w:p>
+            <w:pPr>
+              <w:pStyle w:val="Compact"/>
+              <w:jc w:val="left"/>
+            </w:pPr>
+            <w:r>
+              <w:t xml:space="preserve">113 d, continuous flooding, 14-d pre-harvest drain, slag PSD</w:t>
+            </w:r>
+            <w:r>
+              <w:t xml:space="preserve"> </w:t>
+            </w:r>
+            <w:r>
+              <w:rPr>
+                <w:rStyle w:val="VerbatimChar"/>
+              </w:rPr>
+              <w:t xml:space="preserve">psdrain_wangslag.in</w:t>
+            </w:r>
+          </w:p>
+        </w:tc>
+      </w:tr>
+      <w:tr>
+        <w:tc>
+          <w:tcPr/>
+          <w:p>
+            <w:pPr>
+              <w:pStyle w:val="Compact"/>
+              <w:jc w:val="left"/>
+            </w:pPr>
+            <w:r>
+              <w:t xml:space="preserve">Gong 2026</w:t>
+            </w:r>
+          </w:p>
+        </w:tc>
+        <w:tc>
+          <w:tcPr/>
+          <w:p>
+            <w:pPr>
+              <w:pStyle w:val="Compact"/>
+              <w:jc w:val="left"/>
+            </w:pPr>
+            <w:r>
+              <w:t xml:space="preserve">0.3 m column, 0.5 wt% calcite (vc_r03c05)</w:t>
+            </w:r>
+          </w:p>
+        </w:tc>
+        <w:tc>
+          <w:tcPr/>
+          <w:p>
+            <w:pPr>
+              <w:pStyle w:val="Compact"/>
+              <w:jc w:val="left"/>
+            </w:pPr>
+            <w:r>
+              <w:t xml:space="preserve">pgongc_0 / pgongd_36 (top 0.086 m); pgongc_36 (whole column)</w:t>
+            </w:r>
+          </w:p>
+        </w:tc>
+        <w:tc>
+          <w:tcPr/>
+          <w:p>
+            <w:pPr>
+              <w:pStyle w:val="Compact"/>
+              <w:jc w:val="left"/>
+            </w:pPr>
+            <w:r>
+              <w:t xml:space="preserve">131 d, AWD, 240 kg N ha⁻¹</w:t>
+            </w:r>
+          </w:p>
+        </w:tc>
+      </w:tr>
+      <w:tr>
+        <w:tc>
+          <w:tcPr/>
+          <w:p>
+            <w:pPr>
+              <w:pStyle w:val="Compact"/>
+              <w:jc w:val="left"/>
+            </w:pPr>
+            <w:r>
+              <w:t xml:space="preserve">Park 2026</w:t>
+            </w:r>
+          </w:p>
+        </w:tc>
+        <w:tc>
+          <w:tcPr/>
+          <w:p>
+            <w:pPr>
+              <w:pStyle w:val="Compact"/>
+              <w:jc w:val="left"/>
+            </w:pPr>
+            <w:r>
+              <w:t xml:space="preserve">0.3 m column, 2 meq L⁻¹ (vc_r03i10)</w:t>
+            </w:r>
+          </w:p>
+        </w:tc>
+        <w:tc>
+          <w:tcPr/>
+          <w:p>
+            <w:pPr>
+              <w:pStyle w:val="Compact"/>
+              <w:jc w:val="left"/>
+            </w:pPr>
+            <w:r>
+              <w:t xml:space="preserve">pparka_0 / pparka_390, pparka_780</w:t>
+            </w:r>
+          </w:p>
+        </w:tc>
+        <w:tc>
+          <w:tcPr/>
+          <w:p>
+            <w:pPr>
+              <w:pStyle w:val="Compact"/>
+              <w:jc w:val="left"/>
+            </w:pPr>
+            <w:r>
+              <w:t xml:space="preserve">100 d, no plant processes, q 10⁻⁴ m yr⁻¹, rock Fe(III) 3%</w:t>
+            </w:r>
+          </w:p>
+        </w:tc>
+      </w:tr>
+      <w:tr>
+        <w:tc>
+          <w:tcPr/>
+          <w:p>
+            <w:pPr>
+              <w:pStyle w:val="Compact"/>
+              <w:jc w:val="left"/>
+            </w:pPr>
+            <w:r>
+              <w:t xml:space="preserve">Uchibayashi 2025</w:t>
+            </w:r>
+          </w:p>
+        </w:tc>
+        <w:tc>
+          <w:tcPr/>
+          <w:p>
+            <w:pPr>
+              <w:pStyle w:val="Compact"/>
+              <w:jc w:val="left"/>
+            </w:pPr>
+            <w:r>
+              <w:t xml:space="preserve">0.3 m column, 0.8 meq L⁻¹ (vc_r03i4)</w:t>
+            </w:r>
+          </w:p>
+        </w:tc>
+        <w:tc>
+          <w:tcPr/>
+          <w:p>
+            <w:pPr>
+              <w:pStyle w:val="Compact"/>
+              <w:jc w:val="left"/>
+            </w:pPr>
+            <w:r>
+              <w:t xml:space="preserve">puchia_0 / puchia_100</w:t>
+            </w:r>
+          </w:p>
+        </w:tc>
+        <w:tc>
+          <w:tcPr/>
+          <w:p>
+            <w:pPr>
+              <w:pStyle w:val="Compact"/>
+              <w:jc w:val="left"/>
+            </w:pPr>
+            <w:r>
+              <w:t xml:space="preserve">99 d, continuous flooding, Akita PSD</w:t>
+            </w:r>
+          </w:p>
+        </w:tc>
+      </w:tr>
+      <w:tr>
+        <w:tc>
+          <w:tcPr/>
+          <w:p>
+            <w:pPr>
+              <w:pStyle w:val="Compact"/>
+              <w:jc w:val="left"/>
+            </w:pPr>
+            <w:r>
+              <w:t xml:space="preserve">Wang 2024</w:t>
+            </w:r>
+          </w:p>
+        </w:tc>
+        <w:tc>
+          <w:tcPr/>
+          <w:p>
+            <w:pPr>
+              <w:pStyle w:val="Compact"/>
+              <w:jc w:val="left"/>
+            </w:pPr>
+            <w:r>
+              <w:t xml:space="preserve">field column with pan, 0.5 wt% calcite</w:t>
+            </w:r>
+          </w:p>
+        </w:tc>
+        <w:tc>
+          <w:tcPr/>
+          <w:p>
+            <w:pPr>
+              <w:pStyle w:val="Compact"/>
+              <w:jc w:val="left"/>
+            </w:pPr>
+            <w:r>
+              <w:t xml:space="preserve">z24_0 / z24_5 (q 1.1); z24q05_</w:t>
+            </w:r>
+            <w:r>
+              <w:rPr>
+                <w:iCs/>
+                <w:i/>
+              </w:rPr>
+              <w:t xml:space="preserve">, z24q025_</w:t>
+            </w:r>
+          </w:p>
+        </w:tc>
+        <w:tc>
+          <w:tcPr/>
+          <w:p>
+            <w:pPr>
+              <w:pStyle w:val="Compact"/>
+              <w:jc w:val="left"/>
+            </w:pPr>
+            <w:r>
+              <w:t xml:space="preserve">153 d, AWD, wollastonite tilled to 0.15 m</w:t>
             </w:r>
           </w:p>
         </w:tc>

</xml_diff>

<commit_message>
Section 3: Wang 2024 whole-column Ca closure, calibration-role column; Ca budget and mineral release scripts
Co-Authored-By: Claude Opus 5.5 <noreply@anthropic.com>
Claude-Session: https://claude.ai/code/session_011eE6rAt4DAy7w44Js7Frnz
</commit_message>
<xml_diff>
--- a/manuscript_gmd/Riceland_SCEPTER_GMD_section3_evaluation_draft.docx
+++ b/manuscript_gmd/Riceland_SCEPTER_GMD_section3_evaluation_draft.docx
@@ -147,6 +147,14 @@
     <w:p>
       <w:pPr>
         <w:pStyle w:val="FirstParagraph"/>
+      </w:pPr>
+      <w:r>
+        <w:t xml:space="preserve">We therefore present Section 3 as model evaluation, not independent validation. Table 3 marks each comparison as calibration-informed or as a prediction of a measurement not used in fitting. We keep the unresolved discrepancies (the ferric-Fe rise in Wang et al., 2014, and the carbonate gain in Wang et al., 2024) as identified targets for model development. We do not require the current version to reproduce every observation.</w:t>
+      </w:r>
+    </w:p>
+    <w:p>
+      <w:pPr>
+        <w:pStyle w:val="BodyText"/>
       </w:pPr>
       <w:r>
         <w:rPr>
@@ -1949,101 +1957,13 @@
           <w:bCs/>
           <w:b/>
         </w:rPr>
-        <w:t xml:space="preserve">Mechanistic interpretation and limitations.</w:t>
-      </w:r>
-    </w:p>
-    <w:p>
-      <w:pPr>
-        <w:pStyle w:val="BodyText"/>
-      </w:pPr>
-      <w:r>
-        <w:t xml:space="preserve">The wollastonite dissolves completely in all three cases. About two thirds of its Ca ends up on the exchange complex. Calcite forms only in short supersaturated windows during drainage, because the plough layer is undersaturated on season average. Lower percolation shifts Ca from leaching into calcite. Even at q = 0.25 m yr⁻¹, however, simulated carbonate reaches only 0.48 t CO₂ ha⁻¹, 40% of the observed 1.20.</w:t>
-      </w:r>
-    </w:p>
-    <w:p>
-      <w:pPr>
-        <w:pStyle w:val="BodyText"/>
-      </w:pPr>
-      <w:r>
-        <w:t xml:space="preserve">We did not fit percolation to the observation. Wang et al. give no hydrological data that would independently justify a low rate. The seasonal pattern of percolation (ponded seepage during flooding, none during drains) is also not resolved by the model’s constant rate, and this may matter for calcite, which forms during drains.</w:t>
-      </w:r>
-    </w:p>
-    <w:p>
-      <w:pPr>
-        <w:pStyle w:val="BodyText"/>
-      </w:pPr>
-      <w:r>
-        <w:t xml:space="preserve">The observed gain corresponds to about 91% of the wollastonite Ca precipitating as carbonate within one season. That is hard to reconcile with the exchange capacity of the soil. It may also include carbonate redistributed from the control or measurement variability, since it is a difference between two plot sets.</w:t>
-      </w:r>
-    </w:p>
-    <w:p>
-      <w:pPr>
-        <w:pStyle w:val="BodyText"/>
-      </w:pPr>
-      <w:r>
-        <w:t xml:space="preserve">The observed treatment–control difference in carbonate stock should not be equated with atmospheric CO₂ removal, for three reasons:</w:t>
-      </w:r>
-    </w:p>
-    <w:p>
-      <w:pPr>
-        <w:numPr>
-          <w:ilvl w:val="0"/>
-          <w:numId w:val="1009"/>
-        </w:numPr>
-        <w:pStyle w:val="Compact"/>
-      </w:pPr>
-      <w:r>
-        <w:t xml:space="preserve">Part of the carbonate C may come from soil respiration rather than the atmosphere.</w:t>
-      </w:r>
-    </w:p>
-    <w:p>
-      <w:pPr>
-        <w:numPr>
-          <w:ilvl w:val="0"/>
-          <w:numId w:val="1009"/>
-        </w:numPr>
-        <w:pStyle w:val="Compact"/>
-      </w:pPr>
-      <w:r>
-        <w:t xml:space="preserve">Carbonate formed in the plough layer can redissolve in later seasons. In multi-year runs, calcite formed during the season partly redissolves during the fallow (Section 4).</w:t>
-      </w:r>
-    </w:p>
-    <w:p>
-      <w:pPr>
-        <w:numPr>
-          <w:ilvl w:val="0"/>
-          <w:numId w:val="1009"/>
-        </w:numPr>
-        <w:pStyle w:val="Compact"/>
-      </w:pPr>
-      <w:r>
-        <w:t xml:space="preserve">Ca leached as bicarbonate is CDR only once it reaches drainage water without degassing.</w:t>
-      </w:r>
-    </w:p>
-    <w:p>
-      <w:pPr>
-        <w:pStyle w:val="FirstParagraph"/>
-      </w:pPr>
-      <w:r>
-        <w:t xml:space="preserve">We therefore treat carbonate stock as an observable and report CDR separately, as potentially durable alkalinity exported below the root zone (Section 4).</w:t>
-      </w:r>
-    </w:p>
-    <w:p>
-      <w:pPr>
-        <w:pStyle w:val="BodyText"/>
-      </w:pPr>
-      <w:r>
-        <w:rPr>
-          <w:bCs/>
-          <w:b/>
-        </w:rPr>
-        <w:t xml:space="preserve">Table 3.</w:t>
-      </w:r>
-      <w:r>
-        <w:t xml:space="preserve"> </w:t>
-      </w:r>
-      <w:r>
-        <w:t xml:space="preserve">Summary of observed and simulated responses (frozen model, K_Si 2 mM, w 0.2).</w:t>
+        <w:t xml:space="preserve">Calcium conservation.</w:t>
+      </w:r>
+      <w:r>
+        <w:t xml:space="preserve"> </w:t>
+      </w:r>
+      <w:r>
+        <w:t xml:space="preserve">The whole-column Ca budget, taken from the model’s own time-integrated fluxes, closes to better than 10⁻¹¹ mol m⁻² in every run. In treatment minus control (mol m⁻²):</w:t>
       </w:r>
     </w:p>
     <w:tbl>
@@ -2054,11 +1974,10 @@
         <w:jc w:val="start"/>
       </w:tblPr>
       <w:tblGrid>
-        <w:gridCol w:w="1584"/>
-        <w:gridCol w:w="1584"/>
-        <w:gridCol w:w="1584"/>
-        <w:gridCol w:w="1584"/>
-        <w:gridCol w:w="1584"/>
+        <w:gridCol w:w="1980"/>
+        <w:gridCol w:w="1980"/>
+        <w:gridCol w:w="1980"/>
+        <w:gridCol w:w="1980"/>
       </w:tblGrid>
       <w:tr>
         <w:trPr>
@@ -2072,55 +1991,43 @@
               <w:jc w:val="left"/>
             </w:pPr>
             <w:r>
-              <w:t xml:space="preserve">Test</w:t>
-            </w:r>
-          </w:p>
-        </w:tc>
-        <w:tc>
-          <w:tcPr/>
-          <w:p>
-            <w:pPr>
-              <w:pStyle w:val="Compact"/>
-              <w:jc w:val="left"/>
-            </w:pPr>
-            <w:r>
-              <w:t xml:space="preserve">Metric</w:t>
-            </w:r>
-          </w:p>
-        </w:tc>
-        <w:tc>
-          <w:tcPr/>
-          <w:p>
-            <w:pPr>
-              <w:pStyle w:val="Compact"/>
-              <w:jc w:val="left"/>
-            </w:pPr>
-            <w:r>
-              <w:t xml:space="preserve">Observed</w:t>
-            </w:r>
-          </w:p>
-        </w:tc>
-        <w:tc>
-          <w:tcPr/>
-          <w:p>
-            <w:pPr>
-              <w:pStyle w:val="Compact"/>
-              <w:jc w:val="left"/>
-            </w:pPr>
-            <w:r>
-              <w:t xml:space="preserve">Model</w:t>
-            </w:r>
-          </w:p>
-        </w:tc>
-        <w:tc>
-          <w:tcPr/>
-          <w:p>
-            <w:pPr>
-              <w:pStyle w:val="Compact"/>
-              <w:jc w:val="left"/>
-            </w:pPr>
-            <w:r>
-              <w:t xml:space="preserve">Assessment</w:t>
+              <w:t xml:space="preserve">Term</w:t>
+            </w:r>
+          </w:p>
+        </w:tc>
+        <w:tc>
+          <w:tcPr/>
+          <w:p>
+            <w:pPr>
+              <w:pStyle w:val="Compact"/>
+              <w:jc w:val="left"/>
+            </w:pPr>
+            <w:r>
+              <w:t xml:space="preserve">q 1.1 m yr⁻¹</w:t>
+            </w:r>
+          </w:p>
+        </w:tc>
+        <w:tc>
+          <w:tcPr/>
+          <w:p>
+            <w:pPr>
+              <w:pStyle w:val="Compact"/>
+              <w:jc w:val="left"/>
+            </w:pPr>
+            <w:r>
+              <w:t xml:space="preserve">q 0.5</w:t>
+            </w:r>
+          </w:p>
+        </w:tc>
+        <w:tc>
+          <w:tcPr/>
+          <w:p>
+            <w:pPr>
+              <w:pStyle w:val="Compact"/>
+              <w:jc w:val="left"/>
+            </w:pPr>
+            <w:r>
+              <w:t xml:space="preserve">q 0.25</w:t>
             </w:r>
           </w:p>
         </w:tc>
@@ -2134,55 +2041,43 @@
               <w:jc w:val="left"/>
             </w:pPr>
             <w:r>
-              <w:t xml:space="preserve">Wang 2014</w:t>
-            </w:r>
-          </w:p>
-        </w:tc>
-        <w:tc>
-          <w:tcPr/>
-          <w:p>
-            <w:pPr>
-              <w:pStyle w:val="Compact"/>
-              <w:jc w:val="left"/>
-            </w:pPr>
-            <w:r>
-              <w:t xml:space="preserve">CH₄ emission change at 2 / 4 / 8 t ha⁻¹</w:t>
-            </w:r>
-          </w:p>
-        </w:tc>
-        <w:tc>
-          <w:tcPr/>
-          <w:p>
-            <w:pPr>
-              <w:pStyle w:val="Compact"/>
-              <w:jc w:val="left"/>
-            </w:pPr>
-            <w:r>
-              <w:t xml:space="preserve">−27 / −43 / −49%</w:t>
-            </w:r>
-          </w:p>
-        </w:tc>
-        <w:tc>
-          <w:tcPr/>
-          <w:p>
-            <w:pPr>
-              <w:pStyle w:val="Compact"/>
-              <w:jc w:val="left"/>
-            </w:pPr>
-            <w:r>
-              <w:t xml:space="preserve">−35 / −43 / −52%</w:t>
-            </w:r>
-          </w:p>
-        </w:tc>
-        <w:tc>
-          <w:tcPr/>
-          <w:p>
-            <w:pPr>
-              <w:pStyle w:val="Compact"/>
-              <w:jc w:val="left"/>
-            </w:pPr>
-            <w:r>
-              <w:t xml:space="preserve">good (2 t ha⁻¹ used in Si calibration)</w:t>
+              <w:t xml:space="preserve">Ca added: wollastonite + its native calcite</w:t>
+            </w:r>
+          </w:p>
+        </w:tc>
+        <w:tc>
+          <w:tcPr/>
+          <w:p>
+            <w:pPr>
+              <w:pStyle w:val="Compact"/>
+              <w:jc w:val="left"/>
+            </w:pPr>
+            <w:r>
+              <w:t xml:space="preserve">3.587 + 0.131 = 3.718</w:t>
+            </w:r>
+          </w:p>
+        </w:tc>
+        <w:tc>
+          <w:tcPr/>
+          <w:p>
+            <w:pPr>
+              <w:pStyle w:val="Compact"/>
+              <w:jc w:val="left"/>
+            </w:pPr>
+            <w:r>
+              <w:t xml:space="preserve">3.718</w:t>
+            </w:r>
+          </w:p>
+        </w:tc>
+        <w:tc>
+          <w:tcPr/>
+          <w:p>
+            <w:pPr>
+              <w:pStyle w:val="Compact"/>
+              <w:jc w:val="left"/>
+            </w:pPr>
+            <w:r>
+              <w:t xml:space="preserve">3.718</w:t>
             </w:r>
           </w:p>
         </w:tc>
@@ -2196,55 +2091,43 @@
               <w:jc w:val="left"/>
             </w:pPr>
             <w:r>
-              <w:t xml:space="preserve">Wang 2014</w:t>
-            </w:r>
-          </w:p>
-        </w:tc>
-        <w:tc>
-          <w:tcPr/>
-          <w:p>
-            <w:pPr>
-              <w:pStyle w:val="Compact"/>
-              <w:jc w:val="left"/>
-            </w:pPr>
-            <w:r>
-              <w:t xml:space="preserve">CH₄ production change</w:t>
-            </w:r>
-          </w:p>
-        </w:tc>
-        <w:tc>
-          <w:tcPr/>
-          <w:p>
-            <w:pPr>
-              <w:pStyle w:val="Compact"/>
-              <w:jc w:val="left"/>
-            </w:pPr>
-            <w:r>
-              <w:t xml:space="preserve">−16 / −33 / −41%</w:t>
-            </w:r>
-          </w:p>
-        </w:tc>
-        <w:tc>
-          <w:tcPr/>
-          <w:p>
-            <w:pPr>
-              <w:pStyle w:val="Compact"/>
-              <w:jc w:val="left"/>
-            </w:pPr>
-            <w:r>
-              <w:t xml:space="preserve">−27 / −33 / −38%</w:t>
-            </w:r>
-          </w:p>
-        </w:tc>
-        <w:tc>
-          <w:tcPr/>
-          <w:p>
-            <w:pPr>
-              <w:pStyle w:val="Compact"/>
-              <w:jc w:val="left"/>
-            </w:pPr>
-            <w:r>
-              <w:t xml:space="preserve">good</w:t>
+              <w:t xml:space="preserve">Wollastonite remaining</w:t>
+            </w:r>
+          </w:p>
+        </w:tc>
+        <w:tc>
+          <w:tcPr/>
+          <w:p>
+            <w:pPr>
+              <w:pStyle w:val="Compact"/>
+              <w:jc w:val="left"/>
+            </w:pPr>
+            <w:r>
+              <w:t xml:space="preserve">0.002</w:t>
+            </w:r>
+          </w:p>
+        </w:tc>
+        <w:tc>
+          <w:tcPr/>
+          <w:p>
+            <w:pPr>
+              <w:pStyle w:val="Compact"/>
+              <w:jc w:val="left"/>
+            </w:pPr>
+            <w:r>
+              <w:t xml:space="preserve">0.002</w:t>
+            </w:r>
+          </w:p>
+        </w:tc>
+        <w:tc>
+          <w:tcPr/>
+          <w:p>
+            <w:pPr>
+              <w:pStyle w:val="Compact"/>
+              <w:jc w:val="left"/>
+            </w:pPr>
+            <w:r>
+              <w:t xml:space="preserve">0.002</w:t>
             </w:r>
           </w:p>
         </w:tc>
@@ -2258,55 +2141,43 @@
               <w:jc w:val="left"/>
             </w:pPr>
             <w:r>
-              <w:t xml:space="preserve">Wang 2014</w:t>
-            </w:r>
-          </w:p>
-        </w:tc>
-        <w:tc>
-          <w:tcPr/>
-          <w:p>
-            <w:pPr>
-              <w:pStyle w:val="Compact"/>
-              <w:jc w:val="left"/>
-            </w:pPr>
-            <w:r>
-              <w:t xml:space="preserve">CH₄ oxidation</w:t>
-            </w:r>
-          </w:p>
-        </w:tc>
-        <w:tc>
-          <w:tcPr/>
-          <w:p>
-            <w:pPr>
-              <w:pStyle w:val="Compact"/>
-              <w:jc w:val="left"/>
-            </w:pPr>
-            <w:r>
-              <w:t xml:space="preserve">~constant</w:t>
-            </w:r>
-          </w:p>
-        </w:tc>
-        <w:tc>
-          <w:tcPr/>
-          <w:p>
-            <w:pPr>
-              <w:pStyle w:val="Compact"/>
-              <w:jc w:val="left"/>
-            </w:pPr>
-            <w:r>
-              <w:t xml:space="preserve">−24 / −29 / −33%</w:t>
-            </w:r>
-          </w:p>
-        </w:tc>
-        <w:tc>
-          <w:tcPr/>
-          <w:p>
-            <w:pPr>
-              <w:pStyle w:val="Compact"/>
-              <w:jc w:val="left"/>
-            </w:pPr>
-            <w:r>
-              <w:t xml:space="preserve">oxidation does not rise, as observed; absolute fraction too high</w:t>
+              <w:t xml:space="preserve">Exchangeable Ca</w:t>
+            </w:r>
+          </w:p>
+        </w:tc>
+        <w:tc>
+          <w:tcPr/>
+          <w:p>
+            <w:pPr>
+              <w:pStyle w:val="Compact"/>
+              <w:jc w:val="left"/>
+            </w:pPr>
+            <w:r>
+              <w:t xml:space="preserve">+2.77</w:t>
+            </w:r>
+          </w:p>
+        </w:tc>
+        <w:tc>
+          <w:tcPr/>
+          <w:p>
+            <w:pPr>
+              <w:pStyle w:val="Compact"/>
+              <w:jc w:val="left"/>
+            </w:pPr>
+            <w:r>
+              <w:t xml:space="preserve">+2.75</w:t>
+            </w:r>
+          </w:p>
+        </w:tc>
+        <w:tc>
+          <w:tcPr/>
+          <w:p>
+            <w:pPr>
+              <w:pStyle w:val="Compact"/>
+              <w:jc w:val="left"/>
+            </w:pPr>
+            <w:r>
+              <w:t xml:space="preserve">+2.59</w:t>
             </w:r>
           </w:p>
         </w:tc>
@@ -2320,55 +2191,43 @@
               <w:jc w:val="left"/>
             </w:pPr>
             <w:r>
-              <w:t xml:space="preserve">Wang 2014</w:t>
-            </w:r>
-          </w:p>
-        </w:tc>
-        <w:tc>
-          <w:tcPr/>
-          <w:p>
-            <w:pPr>
-              <w:pStyle w:val="Compact"/>
-              <w:jc w:val="left"/>
-            </w:pPr>
-            <w:r>
-              <w:t xml:space="preserve">ferric Fe gain at 8 t ha⁻¹</w:t>
-            </w:r>
-          </w:p>
-        </w:tc>
-        <w:tc>
-          <w:tcPr/>
-          <w:p>
-            <w:pPr>
-              <w:pStyle w:val="Compact"/>
-              <w:jc w:val="left"/>
-            </w:pPr>
-            <w:r>
-              <w:t xml:space="preserve">+5.6 g kg⁻¹ (extractable)</w:t>
-            </w:r>
-          </w:p>
-        </w:tc>
-        <w:tc>
-          <w:tcPr/>
-          <w:p>
-            <w:pPr>
-              <w:pStyle w:val="Compact"/>
-              <w:jc w:val="left"/>
-            </w:pPr>
-            <w:r>
-              <w:t xml:space="preserve">+0.5 g kg⁻¹ (reactive Fe(III))</w:t>
-            </w:r>
-          </w:p>
-        </w:tc>
-        <w:tc>
-          <w:tcPr/>
-          <w:p>
-            <w:pPr>
-              <w:pStyle w:val="Compact"/>
-              <w:jc w:val="left"/>
-            </w:pPr>
-            <w:r>
-              <w:t xml:space="preserve">fails; mechanism not reproduced</w:t>
+              <w:t xml:space="preserve">Dissolved Ca (porewater)</w:t>
+            </w:r>
+          </w:p>
+        </w:tc>
+        <w:tc>
+          <w:tcPr/>
+          <w:p>
+            <w:pPr>
+              <w:pStyle w:val="Compact"/>
+              <w:jc w:val="left"/>
+            </w:pPr>
+            <w:r>
+              <w:t xml:space="preserve">+0.10</w:t>
+            </w:r>
+          </w:p>
+        </w:tc>
+        <w:tc>
+          <w:tcPr/>
+          <w:p>
+            <w:pPr>
+              <w:pStyle w:val="Compact"/>
+              <w:jc w:val="left"/>
+            </w:pPr>
+            <w:r>
+              <w:t xml:space="preserve">+0.10</w:t>
+            </w:r>
+          </w:p>
+        </w:tc>
+        <w:tc>
+          <w:tcPr/>
+          <w:p>
+            <w:pPr>
+              <w:pStyle w:val="Compact"/>
+              <w:jc w:val="left"/>
+            </w:pPr>
+            <w:r>
+              <w:t xml:space="preserve">+0.09</w:t>
             </w:r>
           </w:p>
         </w:tc>
@@ -2382,55 +2241,43 @@
               <w:jc w:val="left"/>
             </w:pPr>
             <w:r>
-              <w:t xml:space="preserve">Gong 2026</w:t>
-            </w:r>
-          </w:p>
-        </w:tc>
-        <w:tc>
-          <w:tcPr/>
-          <w:p>
-            <w:pPr>
-              <w:pStyle w:val="Compact"/>
-              <w:jc w:val="left"/>
-            </w:pPr>
-            <w:r>
-              <w:t xml:space="preserve">CH₄ change at 36 t ha⁻¹</w:t>
-            </w:r>
-          </w:p>
-        </w:tc>
-        <w:tc>
-          <w:tcPr/>
-          <w:p>
-            <w:pPr>
-              <w:pStyle w:val="Compact"/>
-              <w:jc w:val="left"/>
-            </w:pPr>
-            <w:r>
-              <w:t xml:space="preserve">−18% (p ≈ 0.1)</w:t>
-            </w:r>
-          </w:p>
-        </w:tc>
-        <w:tc>
-          <w:tcPr/>
-          <w:p>
-            <w:pPr>
-              <w:pStyle w:val="Compact"/>
-              <w:jc w:val="left"/>
-            </w:pPr>
-            <w:r>
-              <w:t xml:space="preserve">−23% (−10% without Si feedback)</w:t>
-            </w:r>
-          </w:p>
-        </w:tc>
-        <w:tc>
-          <w:tcPr/>
-          <w:p>
-            <w:pPr>
-              <w:pStyle w:val="Compact"/>
-              <w:jc w:val="left"/>
-            </w:pPr>
-            <w:r>
-              <w:t xml:space="preserve">overpredicted ~1.3× (used in Si calibration); control 85 vs 52 kg ha⁻¹</w:t>
+              <w:t xml:space="preserve">Calcite, whole column</w:t>
+            </w:r>
+          </w:p>
+        </w:tc>
+        <w:tc>
+          <w:tcPr/>
+          <w:p>
+            <w:pPr>
+              <w:pStyle w:val="Compact"/>
+              <w:jc w:val="left"/>
+            </w:pPr>
+            <w:r>
+              <w:t xml:space="preserve">+0.90 (0.39 t CO₂ ha⁻¹)</w:t>
+            </w:r>
+          </w:p>
+        </w:tc>
+        <w:tc>
+          <w:tcPr/>
+          <w:p>
+            <w:pPr>
+              <w:pStyle w:val="Compact"/>
+              <w:jc w:val="left"/>
+            </w:pPr>
+            <w:r>
+              <w:t xml:space="preserve">+0.91 (0.40)</w:t>
+            </w:r>
+          </w:p>
+        </w:tc>
+        <w:tc>
+          <w:tcPr/>
+          <w:p>
+            <w:pPr>
+              <w:pStyle w:val="Compact"/>
+              <w:jc w:val="left"/>
+            </w:pPr>
+            <w:r>
+              <w:t xml:space="preserve">+1.06 (0.47)</w:t>
             </w:r>
           </w:p>
         </w:tc>
@@ -2444,55 +2291,43 @@
               <w:jc w:val="left"/>
             </w:pPr>
             <w:r>
-              <w:t xml:space="preserve">Park 2026</w:t>
-            </w:r>
-          </w:p>
-        </w:tc>
-        <w:tc>
-          <w:tcPr/>
-          <w:p>
-            <w:pPr>
-              <w:pStyle w:val="Compact"/>
-              <w:jc w:val="left"/>
-            </w:pPr>
-            <w:r>
-              <w:t xml:space="preserve">CH₄ change at 10 / 20 wt%</w:t>
-            </w:r>
-          </w:p>
-        </w:tc>
-        <w:tc>
-          <w:tcPr/>
-          <w:p>
-            <w:pPr>
-              <w:pStyle w:val="Compact"/>
-              <w:jc w:val="left"/>
-            </w:pPr>
-            <w:r>
-              <w:t xml:space="preserve">~−25 / −37%</w:t>
-            </w:r>
-          </w:p>
-        </w:tc>
-        <w:tc>
-          <w:tcPr/>
-          <w:p>
-            <w:pPr>
-              <w:pStyle w:val="Compact"/>
-              <w:jc w:val="left"/>
-            </w:pPr>
-            <w:r>
-              <w:t xml:space="preserve">−20 / −34%</w:t>
-            </w:r>
-          </w:p>
-        </w:tc>
-        <w:tc>
-          <w:tcPr/>
-          <w:p>
-            <w:pPr>
-              <w:pStyle w:val="Compact"/>
-              <w:jc w:val="left"/>
-            </w:pPr>
-            <w:r>
-              <w:t xml:space="preserve">good (no plant pathway)</w:t>
+              <w:t xml:space="preserve">Ca leached out of the column base</w:t>
+            </w:r>
+          </w:p>
+        </w:tc>
+        <w:tc>
+          <w:tcPr/>
+          <w:p>
+            <w:pPr>
+              <w:pStyle w:val="Compact"/>
+              <w:jc w:val="left"/>
+            </w:pPr>
+            <w:r>
+              <w:t xml:space="preserve">−0.05</w:t>
+            </w:r>
+          </w:p>
+        </w:tc>
+        <w:tc>
+          <w:tcPr/>
+          <w:p>
+            <w:pPr>
+              <w:pStyle w:val="Compact"/>
+              <w:jc w:val="left"/>
+            </w:pPr>
+            <w:r>
+              <w:t xml:space="preserve">−0.05</w:t>
+            </w:r>
+          </w:p>
+        </w:tc>
+        <w:tc>
+          <w:tcPr/>
+          <w:p>
+            <w:pPr>
+              <w:pStyle w:val="Compact"/>
+              <w:jc w:val="left"/>
+            </w:pPr>
+            <w:r>
+              <w:t xml:space="preserve">−0.02</w:t>
             </w:r>
           </w:p>
         </w:tc>
@@ -2506,55 +2341,250 @@
               <w:jc w:val="left"/>
             </w:pPr>
             <w:r>
-              <w:t xml:space="preserve">Uchibayashi 2025</w:t>
-            </w:r>
-          </w:p>
-        </w:tc>
-        <w:tc>
-          <w:tcPr/>
-          <w:p>
-            <w:pPr>
-              <w:pStyle w:val="Compact"/>
-              <w:jc w:val="left"/>
-            </w:pPr>
-            <w:r>
-              <w:t xml:space="preserve">Na / Mg release at 100 t ha⁻¹ (mmol m⁻² d⁻¹)</w:t>
-            </w:r>
-          </w:p>
-        </w:tc>
-        <w:tc>
-          <w:tcPr/>
-          <w:p>
-            <w:pPr>
-              <w:pStyle w:val="Compact"/>
-              <w:jc w:val="left"/>
-            </w:pPr>
-            <w:r>
-              <w:t xml:space="preserve">4.6 / 6.5</w:t>
-            </w:r>
-          </w:p>
-        </w:tc>
-        <w:tc>
-          <w:tcPr/>
-          <w:p>
-            <w:pPr>
-              <w:pStyle w:val="Compact"/>
-              <w:jc w:val="left"/>
-            </w:pPr>
-            <w:r>
-              <w:t xml:space="preserve">4.8 / 12.1</w:t>
-            </w:r>
-          </w:p>
-        </w:tc>
-        <w:tc>
-          <w:tcPr/>
-          <w:p>
-            <w:pPr>
-              <w:pStyle w:val="Compact"/>
-              <w:jc w:val="left"/>
-            </w:pPr>
-            <w:r>
-              <w:t xml:space="preserve">Na good; Mg ~2× too fast</w:t>
+              <w:t xml:space="preserve">Sum of sinks</w:t>
+            </w:r>
+          </w:p>
+        </w:tc>
+        <w:tc>
+          <w:tcPr/>
+          <w:p>
+            <w:pPr>
+              <w:pStyle w:val="Compact"/>
+              <w:jc w:val="left"/>
+            </w:pPr>
+            <w:r>
+              <w:t xml:space="preserve">3.72</w:t>
+            </w:r>
+          </w:p>
+        </w:tc>
+        <w:tc>
+          <w:tcPr/>
+          <w:p>
+            <w:pPr>
+              <w:pStyle w:val="Compact"/>
+              <w:jc w:val="left"/>
+            </w:pPr>
+            <w:r>
+              <w:t xml:space="preserve">3.72</w:t>
+            </w:r>
+          </w:p>
+        </w:tc>
+        <w:tc>
+          <w:tcPr/>
+          <w:p>
+            <w:pPr>
+              <w:pStyle w:val="Compact"/>
+              <w:jc w:val="left"/>
+            </w:pPr>
+            <w:r>
+              <w:t xml:space="preserve">3.72</w:t>
+            </w:r>
+          </w:p>
+        </w:tc>
+      </w:tr>
+    </w:tbl>
+    <w:p>
+      <w:pPr>
+        <w:pStyle w:val="BodyText"/>
+      </w:pPr>
+      <w:r>
+        <w:t xml:space="preserve">There are no other Ca sinks in the model: no plant Ca uptake and no other Ca-bearing secondary phase. The Ca that passes below 20 cm (0.05–0.60 mol m⁻², see the percolation table below) is retained deeper in the column, mainly on exchange sites. Leaching from the column base is slightly lower in the treatment than in the control. The carbonate shortfall is therefore not an accounting error. In the model, the added Ca goes mainly to the exchange complex rather than to calcite.</w:t>
+      </w:r>
+    </w:p>
+    <w:p>
+      <w:pPr>
+        <w:pStyle w:val="BodyText"/>
+      </w:pPr>
+      <w:r>
+        <w:rPr>
+          <w:bCs/>
+          <w:b/>
+        </w:rPr>
+        <w:t xml:space="preserve">Mechanistic interpretation and limitations.</w:t>
+      </w:r>
+    </w:p>
+    <w:p>
+      <w:pPr>
+        <w:pStyle w:val="BodyText"/>
+      </w:pPr>
+      <w:r>
+        <w:t xml:space="preserve">The wollastonite dissolves completely in all three cases. About two thirds of its Ca ends up on the exchange complex. Calcite forms only in short supersaturated windows during drainage, because the plough layer is undersaturated on season average. Lower percolation shifts Ca from leaching into calcite. Even at q = 0.25 m yr⁻¹, however, simulated carbonate reaches only 0.48 t CO₂ ha⁻¹, 40% of the observed 1.20.</w:t>
+      </w:r>
+    </w:p>
+    <w:p>
+      <w:pPr>
+        <w:pStyle w:val="BodyText"/>
+      </w:pPr>
+      <w:r>
+        <w:t xml:space="preserve">We did not fit percolation to the observation. Wang et al. give no hydrological data that would independently justify a low rate. The seasonal pattern of percolation (ponded seepage during flooding, none during drains) is also not resolved by the model’s constant rate, and this may matter for calcite, which forms during drains.</w:t>
+      </w:r>
+    </w:p>
+    <w:p>
+      <w:pPr>
+        <w:pStyle w:val="BodyText"/>
+      </w:pPr>
+      <w:r>
+        <w:t xml:space="preserve">The observed gain corresponds to about 91% of the wollastonite Ca precipitating as carbonate within one season. That is hard to reconcile with the exchange capacity of the soil. It may also include carbonate redistributed from the control or measurement variability, since it is a difference between two plot sets.</w:t>
+      </w:r>
+    </w:p>
+    <w:p>
+      <w:pPr>
+        <w:pStyle w:val="BodyText"/>
+      </w:pPr>
+      <w:r>
+        <w:t xml:space="preserve">The observed treatment–control difference in carbonate stock should not be equated with atmospheric CO₂ removal, for three reasons:</w:t>
+      </w:r>
+    </w:p>
+    <w:p>
+      <w:pPr>
+        <w:numPr>
+          <w:ilvl w:val="0"/>
+          <w:numId w:val="1009"/>
+        </w:numPr>
+        <w:pStyle w:val="Compact"/>
+      </w:pPr>
+      <w:r>
+        <w:t xml:space="preserve">Part of the carbonate C may come from soil respiration rather than the atmosphere.</w:t>
+      </w:r>
+    </w:p>
+    <w:p>
+      <w:pPr>
+        <w:numPr>
+          <w:ilvl w:val="0"/>
+          <w:numId w:val="1009"/>
+        </w:numPr>
+        <w:pStyle w:val="Compact"/>
+      </w:pPr>
+      <w:r>
+        <w:t xml:space="preserve">Carbonate formed in the plough layer can redissolve in later seasons. In multi-year runs, calcite formed during the season partly redissolves during the fallow (Section 4).</w:t>
+      </w:r>
+    </w:p>
+    <w:p>
+      <w:pPr>
+        <w:numPr>
+          <w:ilvl w:val="0"/>
+          <w:numId w:val="1009"/>
+        </w:numPr>
+        <w:pStyle w:val="Compact"/>
+      </w:pPr>
+      <w:r>
+        <w:t xml:space="preserve">Ca leached as bicarbonate is CDR only once it reaches drainage water without degassing.</w:t>
+      </w:r>
+    </w:p>
+    <w:p>
+      <w:pPr>
+        <w:pStyle w:val="FirstParagraph"/>
+      </w:pPr>
+      <w:r>
+        <w:t xml:space="preserve">We therefore treat carbonate stock as an observable and report CDR separately, as potentially durable alkalinity exported below the root zone (Section 4).</w:t>
+      </w:r>
+    </w:p>
+    <w:p>
+      <w:pPr>
+        <w:pStyle w:val="BodyText"/>
+      </w:pPr>
+      <w:r>
+        <w:rPr>
+          <w:bCs/>
+          <w:b/>
+        </w:rPr>
+        <w:t xml:space="preserve">Table 3.</w:t>
+      </w:r>
+      <w:r>
+        <w:t xml:space="preserve"> </w:t>
+      </w:r>
+      <w:r>
+        <w:t xml:space="preserve">Summary of observed and simulated responses (frozen model, K_Si 2 mM, w 0.2).</w:t>
+      </w:r>
+    </w:p>
+    <w:tbl>
+      <w:tblPr>
+        <w:tblStyle w:val="Table"/>
+        <w:tblW w:type="pct" w:w="5000"/>
+        <w:tblLook w:firstRow="1" w:lastRow="0" w:firstColumn="0" w:lastColumn="0" w:noHBand="0" w:noVBand="0" w:val="0020"/>
+        <w:jc w:val="start"/>
+      </w:tblPr>
+      <w:tblGrid>
+        <w:gridCol w:w="1320"/>
+        <w:gridCol w:w="1320"/>
+        <w:gridCol w:w="1320"/>
+        <w:gridCol w:w="1320"/>
+        <w:gridCol w:w="1320"/>
+        <w:gridCol w:w="1320"/>
+      </w:tblGrid>
+      <w:tr>
+        <w:trPr>
+          <w:tblHeader w:val="true"/>
+        </w:trPr>
+        <w:tc>
+          <w:tcPr/>
+          <w:p>
+            <w:pPr>
+              <w:pStyle w:val="Compact"/>
+              <w:jc w:val="left"/>
+            </w:pPr>
+            <w:r>
+              <w:t xml:space="preserve">Test</w:t>
+            </w:r>
+          </w:p>
+        </w:tc>
+        <w:tc>
+          <w:tcPr/>
+          <w:p>
+            <w:pPr>
+              <w:pStyle w:val="Compact"/>
+              <w:jc w:val="left"/>
+            </w:pPr>
+            <w:r>
+              <w:t xml:space="preserve">Metric</w:t>
+            </w:r>
+          </w:p>
+        </w:tc>
+        <w:tc>
+          <w:tcPr/>
+          <w:p>
+            <w:pPr>
+              <w:pStyle w:val="Compact"/>
+              <w:jc w:val="left"/>
+            </w:pPr>
+            <w:r>
+              <w:t xml:space="preserve">Observed</w:t>
+            </w:r>
+          </w:p>
+        </w:tc>
+        <w:tc>
+          <w:tcPr/>
+          <w:p>
+            <w:pPr>
+              <w:pStyle w:val="Compact"/>
+              <w:jc w:val="left"/>
+            </w:pPr>
+            <w:r>
+              <w:t xml:space="preserve">Model</w:t>
+            </w:r>
+          </w:p>
+        </w:tc>
+        <w:tc>
+          <w:tcPr/>
+          <w:p>
+            <w:pPr>
+              <w:pStyle w:val="Compact"/>
+              <w:jc w:val="left"/>
+            </w:pPr>
+            <w:r>
+              <w:t xml:space="preserve">Assessment</w:t>
+            </w:r>
+          </w:p>
+        </w:tc>
+        <w:tc>
+          <w:tcPr/>
+          <w:p>
+            <w:pPr>
+              <w:pStyle w:val="Compact"/>
+              <w:jc w:val="left"/>
+            </w:pPr>
+            <w:r>
+              <w:t xml:space="preserve">Role in calibration</w:t>
             </w:r>
           </w:p>
         </w:tc>
@@ -2568,6 +2598,524 @@
               <w:jc w:val="left"/>
             </w:pPr>
             <w:r>
+              <w:t xml:space="preserve">Wang 2014</w:t>
+            </w:r>
+          </w:p>
+        </w:tc>
+        <w:tc>
+          <w:tcPr/>
+          <w:p>
+            <w:pPr>
+              <w:pStyle w:val="Compact"/>
+              <w:jc w:val="left"/>
+            </w:pPr>
+            <w:r>
+              <w:t xml:space="preserve">CH₄ emission change at 2 / 4 / 8 t ha⁻¹</w:t>
+            </w:r>
+          </w:p>
+        </w:tc>
+        <w:tc>
+          <w:tcPr/>
+          <w:p>
+            <w:pPr>
+              <w:pStyle w:val="Compact"/>
+              <w:jc w:val="left"/>
+            </w:pPr>
+            <w:r>
+              <w:t xml:space="preserve">−27 / −43 / −49%</w:t>
+            </w:r>
+          </w:p>
+        </w:tc>
+        <w:tc>
+          <w:tcPr/>
+          <w:p>
+            <w:pPr>
+              <w:pStyle w:val="Compact"/>
+              <w:jc w:val="left"/>
+            </w:pPr>
+            <w:r>
+              <w:t xml:space="preserve">−35 / −43 / −52%</w:t>
+            </w:r>
+          </w:p>
+        </w:tc>
+        <w:tc>
+          <w:tcPr/>
+          <w:p>
+            <w:pPr>
+              <w:pStyle w:val="Compact"/>
+              <w:jc w:val="left"/>
+            </w:pPr>
+            <w:r>
+              <w:t xml:space="preserve">good (2 t ha⁻¹ used in Si calibration)</w:t>
+            </w:r>
+          </w:p>
+        </w:tc>
+        <w:tc>
+          <w:tcPr/>
+          <w:p>
+            <w:pPr>
+              <w:pStyle w:val="Compact"/>
+              <w:jc w:val="left"/>
+            </w:pPr>
+            <w:r>
+              <w:t xml:space="preserve">calibration-informed at 2 t ha⁻¹; prediction at 4, 8 t ha⁻¹</w:t>
+            </w:r>
+          </w:p>
+        </w:tc>
+      </w:tr>
+      <w:tr>
+        <w:tc>
+          <w:tcPr/>
+          <w:p>
+            <w:pPr>
+              <w:pStyle w:val="Compact"/>
+              <w:jc w:val="left"/>
+            </w:pPr>
+            <w:r>
+              <w:t xml:space="preserve">Wang 2014</w:t>
+            </w:r>
+          </w:p>
+        </w:tc>
+        <w:tc>
+          <w:tcPr/>
+          <w:p>
+            <w:pPr>
+              <w:pStyle w:val="Compact"/>
+              <w:jc w:val="left"/>
+            </w:pPr>
+            <w:r>
+              <w:t xml:space="preserve">CH₄ production change</w:t>
+            </w:r>
+          </w:p>
+        </w:tc>
+        <w:tc>
+          <w:tcPr/>
+          <w:p>
+            <w:pPr>
+              <w:pStyle w:val="Compact"/>
+              <w:jc w:val="left"/>
+            </w:pPr>
+            <w:r>
+              <w:t xml:space="preserve">−16 / −33 / −41%</w:t>
+            </w:r>
+          </w:p>
+        </w:tc>
+        <w:tc>
+          <w:tcPr/>
+          <w:p>
+            <w:pPr>
+              <w:pStyle w:val="Compact"/>
+              <w:jc w:val="left"/>
+            </w:pPr>
+            <w:r>
+              <w:t xml:space="preserve">−27 / −33 / −38%</w:t>
+            </w:r>
+          </w:p>
+        </w:tc>
+        <w:tc>
+          <w:tcPr/>
+          <w:p>
+            <w:pPr>
+              <w:pStyle w:val="Compact"/>
+              <w:jc w:val="left"/>
+            </w:pPr>
+            <w:r>
+              <w:t xml:space="preserve">good</w:t>
+            </w:r>
+          </w:p>
+        </w:tc>
+        <w:tc>
+          <w:tcPr/>
+          <w:p>
+            <w:pPr>
+              <w:pStyle w:val="Compact"/>
+              <w:jc w:val="left"/>
+            </w:pPr>
+            <w:r>
+              <w:t xml:space="preserve">prediction</w:t>
+            </w:r>
+          </w:p>
+        </w:tc>
+      </w:tr>
+      <w:tr>
+        <w:tc>
+          <w:tcPr/>
+          <w:p>
+            <w:pPr>
+              <w:pStyle w:val="Compact"/>
+              <w:jc w:val="left"/>
+            </w:pPr>
+            <w:r>
+              <w:t xml:space="preserve">Wang 2014</w:t>
+            </w:r>
+          </w:p>
+        </w:tc>
+        <w:tc>
+          <w:tcPr/>
+          <w:p>
+            <w:pPr>
+              <w:pStyle w:val="Compact"/>
+              <w:jc w:val="left"/>
+            </w:pPr>
+            <w:r>
+              <w:t xml:space="preserve">CH₄ oxidation</w:t>
+            </w:r>
+          </w:p>
+        </w:tc>
+        <w:tc>
+          <w:tcPr/>
+          <w:p>
+            <w:pPr>
+              <w:pStyle w:val="Compact"/>
+              <w:jc w:val="left"/>
+            </w:pPr>
+            <w:r>
+              <w:t xml:space="preserve">~constant</w:t>
+            </w:r>
+          </w:p>
+        </w:tc>
+        <w:tc>
+          <w:tcPr/>
+          <w:p>
+            <w:pPr>
+              <w:pStyle w:val="Compact"/>
+              <w:jc w:val="left"/>
+            </w:pPr>
+            <w:r>
+              <w:t xml:space="preserve">−24 / −29 / −33%</w:t>
+            </w:r>
+          </w:p>
+        </w:tc>
+        <w:tc>
+          <w:tcPr/>
+          <w:p>
+            <w:pPr>
+              <w:pStyle w:val="Compact"/>
+              <w:jc w:val="left"/>
+            </w:pPr>
+            <w:r>
+              <w:t xml:space="preserve">oxidation does not rise, as observed; absolute fraction too high</w:t>
+            </w:r>
+          </w:p>
+        </w:tc>
+        <w:tc>
+          <w:tcPr/>
+          <w:p>
+            <w:pPr>
+              <w:pStyle w:val="Compact"/>
+              <w:jc w:val="left"/>
+            </w:pPr>
+            <w:r>
+              <w:t xml:space="preserve">prediction</w:t>
+            </w:r>
+          </w:p>
+        </w:tc>
+      </w:tr>
+      <w:tr>
+        <w:tc>
+          <w:tcPr/>
+          <w:p>
+            <w:pPr>
+              <w:pStyle w:val="Compact"/>
+              <w:jc w:val="left"/>
+            </w:pPr>
+            <w:r>
+              <w:t xml:space="preserve">Wang 2014</w:t>
+            </w:r>
+          </w:p>
+        </w:tc>
+        <w:tc>
+          <w:tcPr/>
+          <w:p>
+            <w:pPr>
+              <w:pStyle w:val="Compact"/>
+              <w:jc w:val="left"/>
+            </w:pPr>
+            <w:r>
+              <w:t xml:space="preserve">ferric Fe gain at 8 t ha⁻¹</w:t>
+            </w:r>
+          </w:p>
+        </w:tc>
+        <w:tc>
+          <w:tcPr/>
+          <w:p>
+            <w:pPr>
+              <w:pStyle w:val="Compact"/>
+              <w:jc w:val="left"/>
+            </w:pPr>
+            <w:r>
+              <w:t xml:space="preserve">+5.6 g kg⁻¹ (extractable)</w:t>
+            </w:r>
+          </w:p>
+        </w:tc>
+        <w:tc>
+          <w:tcPr/>
+          <w:p>
+            <w:pPr>
+              <w:pStyle w:val="Compact"/>
+              <w:jc w:val="left"/>
+            </w:pPr>
+            <w:r>
+              <w:t xml:space="preserve">+0.5 g kg⁻¹ (reactive Fe(III))</w:t>
+            </w:r>
+          </w:p>
+        </w:tc>
+        <w:tc>
+          <w:tcPr/>
+          <w:p>
+            <w:pPr>
+              <w:pStyle w:val="Compact"/>
+              <w:jc w:val="left"/>
+            </w:pPr>
+            <w:r>
+              <w:t xml:space="preserve">fails; mechanism not reproduced</w:t>
+            </w:r>
+          </w:p>
+        </w:tc>
+        <w:tc>
+          <w:tcPr/>
+          <w:p>
+            <w:pPr>
+              <w:pStyle w:val="Compact"/>
+              <w:jc w:val="left"/>
+            </w:pPr>
+            <w:r>
+              <w:t xml:space="preserve">prediction</w:t>
+            </w:r>
+          </w:p>
+        </w:tc>
+      </w:tr>
+      <w:tr>
+        <w:tc>
+          <w:tcPr/>
+          <w:p>
+            <w:pPr>
+              <w:pStyle w:val="Compact"/>
+              <w:jc w:val="left"/>
+            </w:pPr>
+            <w:r>
+              <w:t xml:space="preserve">Gong 2026</w:t>
+            </w:r>
+          </w:p>
+        </w:tc>
+        <w:tc>
+          <w:tcPr/>
+          <w:p>
+            <w:pPr>
+              <w:pStyle w:val="Compact"/>
+              <w:jc w:val="left"/>
+            </w:pPr>
+            <w:r>
+              <w:t xml:space="preserve">CH₄ change at 36 t ha⁻¹</w:t>
+            </w:r>
+          </w:p>
+        </w:tc>
+        <w:tc>
+          <w:tcPr/>
+          <w:p>
+            <w:pPr>
+              <w:pStyle w:val="Compact"/>
+              <w:jc w:val="left"/>
+            </w:pPr>
+            <w:r>
+              <w:t xml:space="preserve">−18% (p ≈ 0.1)</w:t>
+            </w:r>
+          </w:p>
+        </w:tc>
+        <w:tc>
+          <w:tcPr/>
+          <w:p>
+            <w:pPr>
+              <w:pStyle w:val="Compact"/>
+              <w:jc w:val="left"/>
+            </w:pPr>
+            <w:r>
+              <w:t xml:space="preserve">−23% (−10% without Si feedback)</w:t>
+            </w:r>
+          </w:p>
+        </w:tc>
+        <w:tc>
+          <w:tcPr/>
+          <w:p>
+            <w:pPr>
+              <w:pStyle w:val="Compact"/>
+              <w:jc w:val="left"/>
+            </w:pPr>
+            <w:r>
+              <w:t xml:space="preserve">overpredicted ~1.3× (used in Si calibration); control 85 vs 52 kg ha⁻¹</w:t>
+            </w:r>
+          </w:p>
+        </w:tc>
+        <w:tc>
+          <w:tcPr/>
+          <w:p>
+            <w:pPr>
+              <w:pStyle w:val="Compact"/>
+              <w:jc w:val="left"/>
+            </w:pPr>
+            <w:r>
+              <w:t xml:space="preserve">calibration-informed</w:t>
+            </w:r>
+          </w:p>
+        </w:tc>
+      </w:tr>
+      <w:tr>
+        <w:tc>
+          <w:tcPr/>
+          <w:p>
+            <w:pPr>
+              <w:pStyle w:val="Compact"/>
+              <w:jc w:val="left"/>
+            </w:pPr>
+            <w:r>
+              <w:t xml:space="preserve">Park 2026</w:t>
+            </w:r>
+          </w:p>
+        </w:tc>
+        <w:tc>
+          <w:tcPr/>
+          <w:p>
+            <w:pPr>
+              <w:pStyle w:val="Compact"/>
+              <w:jc w:val="left"/>
+            </w:pPr>
+            <w:r>
+              <w:t xml:space="preserve">CH₄ change at 10 / 20 wt%</w:t>
+            </w:r>
+          </w:p>
+        </w:tc>
+        <w:tc>
+          <w:tcPr/>
+          <w:p>
+            <w:pPr>
+              <w:pStyle w:val="Compact"/>
+              <w:jc w:val="left"/>
+            </w:pPr>
+            <w:r>
+              <w:t xml:space="preserve">~−25 / −37%</w:t>
+            </w:r>
+          </w:p>
+        </w:tc>
+        <w:tc>
+          <w:tcPr/>
+          <w:p>
+            <w:pPr>
+              <w:pStyle w:val="Compact"/>
+              <w:jc w:val="left"/>
+            </w:pPr>
+            <w:r>
+              <w:t xml:space="preserve">−20 / −34%</w:t>
+            </w:r>
+          </w:p>
+        </w:tc>
+        <w:tc>
+          <w:tcPr/>
+          <w:p>
+            <w:pPr>
+              <w:pStyle w:val="Compact"/>
+              <w:jc w:val="left"/>
+            </w:pPr>
+            <w:r>
+              <w:t xml:space="preserve">good (no plant pathway)</w:t>
+            </w:r>
+          </w:p>
+        </w:tc>
+        <w:tc>
+          <w:tcPr/>
+          <w:p>
+            <w:pPr>
+              <w:pStyle w:val="Compact"/>
+              <w:jc w:val="left"/>
+            </w:pPr>
+            <w:r>
+              <w:t xml:space="preserve">prediction</w:t>
+            </w:r>
+          </w:p>
+        </w:tc>
+      </w:tr>
+      <w:tr>
+        <w:tc>
+          <w:tcPr/>
+          <w:p>
+            <w:pPr>
+              <w:pStyle w:val="Compact"/>
+              <w:jc w:val="left"/>
+            </w:pPr>
+            <w:r>
+              <w:t xml:space="preserve">Uchibayashi 2025</w:t>
+            </w:r>
+          </w:p>
+        </w:tc>
+        <w:tc>
+          <w:tcPr/>
+          <w:p>
+            <w:pPr>
+              <w:pStyle w:val="Compact"/>
+              <w:jc w:val="left"/>
+            </w:pPr>
+            <w:r>
+              <w:t xml:space="preserve">Na / Mg release at 100 t ha⁻¹ (mmol m⁻² d⁻¹)</w:t>
+            </w:r>
+          </w:p>
+        </w:tc>
+        <w:tc>
+          <w:tcPr/>
+          <w:p>
+            <w:pPr>
+              <w:pStyle w:val="Compact"/>
+              <w:jc w:val="left"/>
+            </w:pPr>
+            <w:r>
+              <w:t xml:space="preserve">4.6 / 6.5</w:t>
+            </w:r>
+          </w:p>
+        </w:tc>
+        <w:tc>
+          <w:tcPr/>
+          <w:p>
+            <w:pPr>
+              <w:pStyle w:val="Compact"/>
+              <w:jc w:val="left"/>
+            </w:pPr>
+            <w:r>
+              <w:t xml:space="preserve">4.8 / 12.1</w:t>
+            </w:r>
+          </w:p>
+        </w:tc>
+        <w:tc>
+          <w:tcPr/>
+          <w:p>
+            <w:pPr>
+              <w:pStyle w:val="Compact"/>
+              <w:jc w:val="left"/>
+            </w:pPr>
+            <w:r>
+              <w:t xml:space="preserve">Na good; Mg ~2× too fast</w:t>
+            </w:r>
+          </w:p>
+        </w:tc>
+        <w:tc>
+          <w:tcPr/>
+          <w:p>
+            <w:pPr>
+              <w:pStyle w:val="Compact"/>
+              <w:jc w:val="left"/>
+            </w:pPr>
+            <w:r>
+              <w:t xml:space="preserve">calibration-informed</w:t>
+            </w:r>
+          </w:p>
+        </w:tc>
+      </w:tr>
+      <w:tr>
+        <w:tc>
+          <w:tcPr/>
+          <w:p>
+            <w:pPr>
+              <w:pStyle w:val="Compact"/>
+              <w:jc w:val="left"/>
+            </w:pPr>
+            <w:r>
               <w:t xml:space="preserve">Wang 2024</w:t>
             </w:r>
           </w:p>
@@ -2617,6 +3165,18 @@
             </w:pPr>
             <w:r>
               <w:t xml:space="preserve">underpredicted ~2.5–4×</w:t>
+            </w:r>
+          </w:p>
+        </w:tc>
+        <w:tc>
+          <w:tcPr/>
+          <w:p>
+            <w:pPr>
+              <w:pStyle w:val="Compact"/>
+              <w:jc w:val="left"/>
+            </w:pPr>
+            <w:r>
+              <w:t xml:space="preserve">prediction</w:t>
             </w:r>
           </w:p>
         </w:tc>

</xml_diff>

<commit_message>
Section 3.2: slag Fe mass balance rules out slag as the source of the ferric-Fe rise
Co-Authored-By: Claude Opus 5.5 <noreply@anthropic.com>
Claude-Session: https://claude.ai/code/session_011eE6rAt4DAy7w44Js7Frnz
</commit_message>
<xml_diff>
--- a/manuscript_gmd/Riceland_SCEPTER_GMD_section3_evaluation_draft.docx
+++ b/manuscript_gmd/Riceland_SCEPTER_GMD_section3_evaluation_draft.docx
@@ -876,19 +876,7 @@
         <w:pStyle w:val="BodyText"/>
       </w:pPr>
       <w:r>
-        <w:t xml:space="preserve">The observed ferric-Fe rise therefore remains unexplained. Candidate explanations:</w:t>
-      </w:r>
-    </w:p>
-    <w:p>
-      <w:pPr>
-        <w:numPr>
-          <w:ilvl w:val="0"/>
-          <w:numId w:val="1005"/>
-        </w:numPr>
-        <w:pStyle w:val="Compact"/>
-      </w:pPr>
-      <w:r>
-        <w:t xml:space="preserve">Fe supplied by the slag itself (4.8 wt% Fe₂O₃, plus metallic and ferrous Fe not reported).</w:t>
+        <w:t xml:space="preserve">The observed ferric-Fe rise therefore remains unexplained. It cannot come from the slag itself. The slag’s Fe (4.8 wt% Fe₂O₃; 33.6 g Fe kg⁻¹, or 269 kg Fe ha⁻¹ at 8 t ha⁻¹, as reported by Wang et al.) is included in the model as reactive ferrihydrite. Spread through the 0–30 cm sampled layer (bulk density ~1.0 g cm⁻³, ~3000 t soil ha⁻¹), it adds only ~0.09 g Fe kg⁻¹. The observed increases are about 50 times larger: +5.6 g kg⁻¹ ferric Fe and +4.4 g kg⁻¹ 1 M HCl-extractable total Fe, equivalent to ~13–17 t Fe ha⁻¹. They therefore reflect a change in how much native soil Fe the extraction recovers, or sampling variability, not an Fe input. Candidate explanations:</w:t>
       </w:r>
     </w:p>
     <w:p>

</xml_diff>

<commit_message>
Section 3.5: observation-equivalent Mg and olivine rate sensitivity (not adopted)
Co-Authored-By: Claude Opus 5.5 <noreply@anthropic.com>
Claude-Session: https://claude.ai/code/session_011eE6rAt4DAy7w44Js7Frnz
</commit_message>
<xml_diff>
--- a/manuscript_gmd/Riceland_SCEPTER_GMD_section3_evaluation_draft.docx
+++ b/manuscript_gmd/Riceland_SCEPTER_GMD_section3_evaluation_draft.docx
@@ -1516,6 +1516,370 @@
         <w:pStyle w:val="FirstParagraph"/>
       </w:pPr>
       <w:r>
+        <w:rPr>
+          <w:bCs/>
+          <w:b/>
+        </w:rPr>
+        <w:t xml:space="preserve">Comparing like with like.</w:t>
+      </w:r>
+      <w:r>
+        <w:t xml:space="preserve"> </w:t>
+      </w:r>
+      <w:r>
+        <w:t xml:space="preserve">Uchibayashi et al. do not measure dissolution directly. They infer release as the treatment-minus-control change in NH₄OAc-exchangeable cations (after harvest minus before planting) plus plant uptake, in pots sealed against leaching. The observation-equivalent model quantity is the change in exchangeable plus porewater Mg; the model has no Mg-bearing secondary phase and no plant Mg uptake, so plant uptake stays in the soil pools. In the reference run this is 11.5 mmol Mg m⁻² d⁻¹, against 12.1 dissolved. The 0.55 difference is leaching through the column base, which the sealed pots prevented. For Na the same comparison gives 3.8 against 4.8 dissolved, because more Na leaches. In a sealed pot the two quantities would be nearly identical. The Mg discrepancy is therefore not an artefact of comparing different quantities.</w:t>
+      </w:r>
+    </w:p>
+    <w:p>
+      <w:pPr>
+        <w:pStyle w:val="BodyText"/>
+      </w:pPr>
+      <w:r>
+        <w:rPr>
+          <w:bCs/>
+          <w:b/>
+        </w:rPr>
+        <w:t xml:space="preserve">Olivine sensitivity (labelled sensitivity; reference unchanged).</w:t>
+      </w:r>
+      <w:r>
+        <w:t xml:space="preserve"> </w:t>
+      </w:r>
+      <w:r>
+        <w:t xml:space="preserve">Only the olivine rate constant was scaled; plagioclase and pyroxene were left as in the reference.</w:t>
+      </w:r>
+    </w:p>
+    <w:tbl>
+      <w:tblPr>
+        <w:tblStyle w:val="Table"/>
+        <w:tblW w:type="pct" w:w="5000"/>
+        <w:tblLook w:firstRow="1" w:lastRow="0" w:firstColumn="0" w:lastColumn="0" w:noHBand="0" w:noVBand="0" w:val="0020"/>
+        <w:jc w:val="start"/>
+      </w:tblPr>
+      <w:tblGrid>
+        <w:gridCol w:w="1584"/>
+        <w:gridCol w:w="1584"/>
+        <w:gridCol w:w="1584"/>
+        <w:gridCol w:w="1584"/>
+        <w:gridCol w:w="1584"/>
+      </w:tblGrid>
+      <w:tr>
+        <w:trPr>
+          <w:tblHeader w:val="true"/>
+        </w:trPr>
+        <w:tc>
+          <w:tcPr/>
+          <w:p>
+            <w:pPr>
+              <w:pStyle w:val="Compact"/>
+              <w:jc w:val="left"/>
+            </w:pPr>
+            <w:r>
+              <w:t xml:space="preserve">Olivine rate</w:t>
+            </w:r>
+          </w:p>
+        </w:tc>
+        <w:tc>
+          <w:tcPr/>
+          <w:p>
+            <w:pPr>
+              <w:pStyle w:val="Compact"/>
+              <w:jc w:val="left"/>
+            </w:pPr>
+            <w:r>
+              <w:t xml:space="preserve">Olivine dissolved in 99 d</w:t>
+            </w:r>
+          </w:p>
+        </w:tc>
+        <w:tc>
+          <w:tcPr/>
+          <w:p>
+            <w:pPr>
+              <w:pStyle w:val="Compact"/>
+              <w:jc w:val="left"/>
+            </w:pPr>
+            <w:r>
+              <w:t xml:space="preserve">Mg release: olivine / augite / total (mmol m⁻² d⁻¹)</w:t>
+            </w:r>
+          </w:p>
+        </w:tc>
+        <w:tc>
+          <w:tcPr/>
+          <w:p>
+            <w:pPr>
+              <w:pStyle w:val="Compact"/>
+              <w:jc w:val="left"/>
+            </w:pPr>
+            <w:r>
+              <w:t xml:space="preserve">Mg, observation-equivalent</w:t>
+            </w:r>
+          </w:p>
+        </w:tc>
+        <w:tc>
+          <w:tcPr/>
+          <w:p>
+            <w:pPr>
+              <w:pStyle w:val="Compact"/>
+              <w:jc w:val="left"/>
+            </w:pPr>
+            <w:r>
+              <w:t xml:space="preserve">Na release</w:t>
+            </w:r>
+          </w:p>
+        </w:tc>
+      </w:tr>
+      <w:tr>
+        <w:tc>
+          <w:tcPr/>
+          <w:p>
+            <w:pPr>
+              <w:pStyle w:val="Compact"/>
+              <w:jc w:val="left"/>
+            </w:pPr>
+            <w:r>
+              <w:t xml:space="preserve">1.0 × (reference)</w:t>
+            </w:r>
+          </w:p>
+        </w:tc>
+        <w:tc>
+          <w:tcPr/>
+          <w:p>
+            <w:pPr>
+              <w:pStyle w:val="Compact"/>
+              <w:jc w:val="left"/>
+            </w:pPr>
+            <w:r>
+              <w:t xml:space="preserve">18%</w:t>
+            </w:r>
+          </w:p>
+        </w:tc>
+        <w:tc>
+          <w:tcPr/>
+          <w:p>
+            <w:pPr>
+              <w:pStyle w:val="Compact"/>
+              <w:jc w:val="left"/>
+            </w:pPr>
+            <w:r>
+              <w:t xml:space="preserve">11.4 / 0.65 / 12.1</w:t>
+            </w:r>
+          </w:p>
+        </w:tc>
+        <w:tc>
+          <w:tcPr/>
+          <w:p>
+            <w:pPr>
+              <w:pStyle w:val="Compact"/>
+              <w:jc w:val="left"/>
+            </w:pPr>
+            <w:r>
+              <w:t xml:space="preserve">11.5</w:t>
+            </w:r>
+          </w:p>
+        </w:tc>
+        <w:tc>
+          <w:tcPr/>
+          <w:p>
+            <w:pPr>
+              <w:pStyle w:val="Compact"/>
+              <w:jc w:val="left"/>
+            </w:pPr>
+            <w:r>
+              <w:t xml:space="preserve">4.8</w:t>
+            </w:r>
+          </w:p>
+        </w:tc>
+      </w:tr>
+      <w:tr>
+        <w:tc>
+          <w:tcPr/>
+          <w:p>
+            <w:pPr>
+              <w:pStyle w:val="Compact"/>
+              <w:jc w:val="left"/>
+            </w:pPr>
+            <w:r>
+              <w:t xml:space="preserve">0.5 ×</w:t>
+            </w:r>
+          </w:p>
+        </w:tc>
+        <w:tc>
+          <w:tcPr/>
+          <w:p>
+            <w:pPr>
+              <w:pStyle w:val="Compact"/>
+              <w:jc w:val="left"/>
+            </w:pPr>
+            <w:r>
+              <w:t xml:space="preserve">10%</w:t>
+            </w:r>
+          </w:p>
+        </w:tc>
+        <w:tc>
+          <w:tcPr/>
+          <w:p>
+            <w:pPr>
+              <w:pStyle w:val="Compact"/>
+              <w:jc w:val="left"/>
+            </w:pPr>
+            <w:r>
+              <w:t xml:space="preserve">6.3 / 0.67 / 6.9</w:t>
+            </w:r>
+          </w:p>
+        </w:tc>
+        <w:tc>
+          <w:tcPr/>
+          <w:p>
+            <w:pPr>
+              <w:pStyle w:val="Compact"/>
+              <w:jc w:val="left"/>
+            </w:pPr>
+            <w:r>
+              <w:t xml:space="preserve">6.6</w:t>
+            </w:r>
+          </w:p>
+        </w:tc>
+        <w:tc>
+          <w:tcPr/>
+          <w:p>
+            <w:pPr>
+              <w:pStyle w:val="Compact"/>
+              <w:jc w:val="left"/>
+            </w:pPr>
+            <w:r>
+              <w:t xml:space="preserve">4.8</w:t>
+            </w:r>
+          </w:p>
+        </w:tc>
+      </w:tr>
+      <w:tr>
+        <w:tc>
+          <w:tcPr/>
+          <w:p>
+            <w:pPr>
+              <w:pStyle w:val="Compact"/>
+              <w:jc w:val="left"/>
+            </w:pPr>
+            <w:r>
+              <w:t xml:space="preserve">0.25 ×</w:t>
+            </w:r>
+          </w:p>
+        </w:tc>
+        <w:tc>
+          <w:tcPr/>
+          <w:p>
+            <w:pPr>
+              <w:pStyle w:val="Compact"/>
+              <w:jc w:val="left"/>
+            </w:pPr>
+            <w:r>
+              <w:t xml:space="preserve">5%</w:t>
+            </w:r>
+          </w:p>
+        </w:tc>
+        <w:tc>
+          <w:tcPr/>
+          <w:p>
+            <w:pPr>
+              <w:pStyle w:val="Compact"/>
+              <w:jc w:val="left"/>
+            </w:pPr>
+            <w:r>
+              <w:t xml:space="preserve">3.3 / 0.68 / 4.0</w:t>
+            </w:r>
+          </w:p>
+        </w:tc>
+        <w:tc>
+          <w:tcPr/>
+          <w:p>
+            <w:pPr>
+              <w:pStyle w:val="Compact"/>
+              <w:jc w:val="left"/>
+            </w:pPr>
+            <w:r>
+              <w:t xml:space="preserve">3.8</w:t>
+            </w:r>
+          </w:p>
+        </w:tc>
+        <w:tc>
+          <w:tcPr/>
+          <w:p>
+            <w:pPr>
+              <w:pStyle w:val="Compact"/>
+              <w:jc w:val="left"/>
+            </w:pPr>
+            <w:r>
+              <w:t xml:space="preserve">4.8</w:t>
+            </w:r>
+          </w:p>
+        </w:tc>
+      </w:tr>
+      <w:tr>
+        <w:tc>
+          <w:tcPr/>
+          <w:p>
+            <w:pPr>
+              <w:pStyle w:val="Compact"/>
+              <w:jc w:val="left"/>
+            </w:pPr>
+            <w:r>
+              <w:t xml:space="preserve">Observed</w:t>
+            </w:r>
+          </w:p>
+        </w:tc>
+        <w:tc>
+          <w:tcPr/>
+          <w:p>
+            <w:pPr>
+              <w:pStyle w:val="Compact"/>
+            </w:pPr>
+          </w:p>
+        </w:tc>
+        <w:tc>
+          <w:tcPr/>
+          <w:p>
+            <w:pPr>
+              <w:pStyle w:val="Compact"/>
+              <w:jc w:val="left"/>
+            </w:pPr>
+            <w:r>
+              <w:t xml:space="preserve">6.5</w:t>
+            </w:r>
+          </w:p>
+        </w:tc>
+        <w:tc>
+          <w:tcPr/>
+          <w:p>
+            <w:pPr>
+              <w:pStyle w:val="Compact"/>
+            </w:pPr>
+          </w:p>
+        </w:tc>
+        <w:tc>
+          <w:tcPr/>
+          <w:p>
+            <w:pPr>
+              <w:pStyle w:val="Compact"/>
+              <w:jc w:val="left"/>
+            </w:pPr>
+            <w:r>
+              <w:t xml:space="preserve">4.6</w:t>
+            </w:r>
+          </w:p>
+        </w:tc>
+      </w:tr>
+    </w:tbl>
+    <w:p>
+      <w:pPr>
+        <w:pStyle w:val="BodyText"/>
+      </w:pPr>
+      <w:r>
+        <w:t xml:space="preserve">Halving the olivine rate reproduces the observed Mg release with Na unchanged, and quartering it under-predicts. We do not adopt the 0.5× rate. No independent mineralogical evidence for it has been established. Possible justifications are olivine partly altered to iddingsite or serpentine, an Fe-rich olivine composition, or armouring of grains, and none of these was characterised for the Akita basalt. Uptake of released Mg into secondary smectite, which the model does not represent, would produce the same apparent shortfall without any change in olivine kinetics.</w:t>
+      </w:r>
+    </w:p>
+    <w:p>
+      <w:pPr>
+        <w:pStyle w:val="BodyText"/>
+      </w:pPr>
+      <w:r>
         <w:t xml:space="preserve">Because the scaling factors were set against these data, the case shows internal consistency rather than independent skill. It also shows that a single mafic factor is too coarse for olivine-bearing rocks.</w:t>
       </w:r>
     </w:p>
@@ -3078,7 +3442,7 @@
               <w:jc w:val="left"/>
             </w:pPr>
             <w:r>
-              <w:t xml:space="preserve">Na good; Mg ~2× too fast</w:t>
+              <w:t xml:space="preserve">Na good; Mg ~2× too fast (olivine; 0.5× olivine rate gives 6.9, not adopted)</w:t>
             </w:r>
           </w:p>
         </w:tc>

</xml_diff>